<commit_message>
Refresh overview deck/doc: add cross-service (microservice) flow
</commit_message>
<xml_diff>
--- a/docs/code-kg-overview.docx
+++ b/docs/code-kg-overview.docx
@@ -15,7 +15,7 @@
         <w:rPr>
           <w:b w:val="0"/>
         </w:rPr>
-        <w:t>A pre-computed, queryable knowledge graph of a Java / Spring Boot / Hibernate codebase, served to AI coding agents over MCP so they can locate the right files and understand structure at task start — instead of guessing.</w:t>
+        <w:t>A pre-computed, queryable knowledge graph of a Java / Spring Boot / Hibernate codebase (and across multiple microservices), served to AI coding agents over MCP so they can locate the right files and understand structure and request flow at task start.</w:t>
       </w:r>
     </w:p>
     <w:p>
@@ -63,7 +63,7 @@
         <w:pStyle w:val="ListBullet"/>
       </w:pPr>
       <w:r>
-        <w:t>The graph is built deterministically (tree-sitter for structure + a Spring/JPA annotation pass), stored in local SQLite, and served over MCP.</w:t>
+        <w:t>Built deterministically (tree-sitter for structure + Spring/JPA annotation passes), stored in local SQLite, served over MCP.</w:t>
       </w:r>
     </w:p>
     <w:p>
@@ -71,7 +71,7 @@
         <w:pStyle w:val="ListBullet"/>
       </w:pPr>
       <w:r>
-        <w:t>An optional LLM enrichment pass (Azure OpenAI) adds a feature→files map. A hard anti-hallucination gate rejects any write that references a node or file not already in the graph.</w:t>
+        <w:t>Optional LLM enrichment (Azure OpenAI) adds a feature-&gt;files map, validated against the live graph (anti-hallucination gate).</w:t>
       </w:r>
     </w:p>
     <w:p>
@@ -79,7 +79,7 @@
         <w:pStyle w:val="ListBullet"/>
       </w:pPr>
       <w:r>
-        <w:t>Scope (this phase): Java, Spring Boot, and Hibernate / Spring Data JPA.</w:t>
+        <w:t>Scope: Java, Spring Boot, Hibernate / Spring Data JPA, and cross-service flow across microservices.</w:t>
       </w:r>
     </w:p>
     <w:p>
@@ -95,7 +95,7 @@
         <w:pStyle w:val="ListBullet"/>
       </w:pPr>
       <w:r>
-        <w:t>[1] Extractor (tree-sitter): walks the Java source and extracts nodes (class, interface, method, field) and edges (calls, imports, extends, implements) with file + line spans.</w:t>
+        <w:t>[1] Extractor (tree-sitter): nodes (class, interface, method, field) and edges (calls, imports, extends, implements).</w:t>
       </w:r>
     </w:p>
     <w:p>
@@ -103,7 +103,7 @@
         <w:pStyle w:val="ListBullet"/>
       </w:pPr>
       <w:r>
-        <w:t>[2] Spring pass: HTTP endpoints (method mapping concatenated with the class-level @RequestMapping prefix), dependency-injection 'injects' edges (constructor + @Autowired), and layer classification (controller/service/repository/dao/config/model/util/entity).</w:t>
+        <w:t>[2] Spring pass: HTTP endpoints (method mapping + class @RequestMapping prefix), DI 'injects' edges, layer classification.</w:t>
       </w:r>
     </w:p>
     <w:p>
@@ -111,7 +111,7 @@
         <w:pStyle w:val="ListBullet"/>
       </w:pPr>
       <w:r>
-        <w:t>[2b] JPA / Hibernate pass: @Entity classes and their table; relationships (@OneToMany/@ManyToOne/@OneToOne/@ManyToMany) with full mapping detail — cascade, fetch, mappedBy, owning vs. inverse side, orphanRemoval, @JoinColumn, @JoinTable; and Spring Data repositories (JpaRepository&lt;T,ID&gt;) linked to the entity they manage via a 'persists' edge.</w:t>
+        <w:t>[2b] JPA / Hibernate pass: @Entity + table, relationships with full mapping (cascade, fetch, mappedBy, owning vs inverse, @JoinColumn, @JoinTable), and JpaRepository-&gt;entity ('persists').</w:t>
       </w:r>
     </w:p>
     <w:p>
@@ -119,7 +119,7 @@
         <w:pStyle w:val="ListBullet"/>
       </w:pPr>
       <w:r>
-        <w:t>[3] Enrichment (optional, Azure OpenAI): a feature/capability→files map, validated against the live graph (anti-hallucination gate).</w:t>
+        <w:t>[2c] Outbound pass: cross-service calls via OpenFeign and RestTemplate, recorded as 'calls_service' edges.</w:t>
       </w:r>
     </w:p>
     <w:p>
@@ -127,7 +127,7 @@
         <w:pStyle w:val="ListBullet"/>
       </w:pPr>
       <w:r>
-        <w:t>[4] MCP server: agents query the graph through kg_* tools.</w:t>
+        <w:t>[3] Enrichment (optional, Azure OpenAI): feature-&gt;files map, anti-hallucination gated.</w:t>
       </w:r>
     </w:p>
     <w:p>
@@ -135,7 +135,15 @@
         <w:pStyle w:val="ListBullet"/>
       </w:pPr>
       <w:r>
-        <w:t>[5] Sync: a full 'index' and an incremental 'reindex' that detects changed files; a scheduled git pull + reindex keeps the graph current with remote pushes.</w:t>
+        <w:t>[4] MCP server: agents query via kg_* tools.</w:t>
+      </w:r>
+    </w:p>
+    <w:p>
+      <w:pPr>
+        <w:pStyle w:val="ListBullet"/>
+      </w:pPr>
+      <w:r>
+        <w:t>[5] Sync / Federate: index (full) and reindex (incremental); federate merges services and links cross-service calls.</w:t>
       </w:r>
     </w:p>
     <w:p>
@@ -143,7 +151,7 @@
         <w:rPr>
           <w:b w:val="0"/>
         </w:rPr>
-        <w:t>Storage: a single local SQLite file at .code-kg/graph.db (gitignored, rebuilt on demand). Schema: nodes, edges, features, feature_files — with JSON 'attrs' on nodes/edges carrying structured detail such as JPA column and relationship mapping.</w:t>
+        <w:t>Storage: a single local SQLite file at .code-kg/graph.db (gitignored, rebuilt on demand). Schema: nodes (with JSON attrs + service), edges (src, dst, kind, attrs), features, feature_files.</w:t>
       </w:r>
     </w:p>
     <w:p>
@@ -167,7 +175,7 @@
         <w:pStyle w:val="ListBullet"/>
       </w:pPr>
       <w:r>
-        <w:t>kg_architecture() — layered overview (counts, layers, endpoints).</w:t>
+        <w:t>kg_architecture, kg_find_files_for_feature, kg_endpoints/kg_endpoint, kg_callers/kg_callees, kg_impact_of.</w:t>
       </w:r>
     </w:p>
     <w:p>
@@ -175,39 +183,7 @@
         <w:pStyle w:val="ListBullet"/>
       </w:pPr>
       <w:r>
-        <w:t>kg_find_files_for_feature(query) — files + entry methods for a capability (kills file-guessing).</w:t>
-      </w:r>
-    </w:p>
-    <w:p>
-      <w:pPr>
-        <w:pStyle w:val="ListBullet"/>
-      </w:pPr>
-      <w:r>
-        <w:t>kg_endpoints() / kg_endpoint(path) — endpoints from code + downstream call chain.</w:t>
-      </w:r>
-    </w:p>
-    <w:p>
-      <w:pPr>
-        <w:pStyle w:val="ListBullet"/>
-      </w:pPr>
-      <w:r>
-        <w:t>kg_callers / kg_callees / kg_impact_of — call edges and reverse-reachability impact analysis.</w:t>
-      </w:r>
-    </w:p>
-    <w:p>
-      <w:pPr>
-        <w:pStyle w:val="ListBullet"/>
-      </w:pPr>
-      <w:r>
-        <w:t>kg_data_model() / kg_entity(name) — JPA/Hibernate entities, tables, relationships (cascade/fetch/owning), and repositories.</w:t>
-      </w:r>
-    </w:p>
-    <w:p>
-      <w:pPr>
-        <w:pStyle w:val="ListBullet"/>
-      </w:pPr>
-      <w:r>
-        <w:t>kg_neighbors / kg_describe — node neighborhood and full detail.</w:t>
+        <w:t>kg_data_model/kg_entity (JPA mapping), kg_service_map/kg_request_flow (cross-service), kg_neighbors/kg_describe.</w:t>
       </w:r>
     </w:p>
     <w:p>
@@ -223,7 +199,7 @@
         <w:pStyle w:val="ListBullet"/>
       </w:pPr>
       <w:r>
-        <w:t>code-kg index &lt;src&gt; · reindex · enrich · serve --repo &lt;repo&gt; · digest</w:t>
+        <w:t>code-kg index | reindex | enrich | serve | digest | federate</w:t>
       </w:r>
     </w:p>
     <w:p>
@@ -231,7 +207,7 @@
         <w:rPr>
           <w:b/>
         </w:rPr>
-        <w:t>Differentiators vs. generic tools (e.g. codegraph)</w:t>
+        <w:t>Differentiators vs generic tools (e.g. codegraph)</w:t>
       </w:r>
     </w:p>
     <w:p>
@@ -239,7 +215,7 @@
         <w:pStyle w:val="ListBullet"/>
       </w:pPr>
       <w:r>
-        <w:t>Spring DI 'injects' edges, a feature→files map, and deep JPA/Hibernate mapping — beyond generic call graphs and route extraction.</w:t>
+        <w:t>Spring DI 'injects' edges, feature-&gt;files map, deep JPA/Hibernate mapping, and cross-service request flow.</w:t>
       </w:r>
     </w:p>
     <w:p>
@@ -255,7 +231,63 @@
         <w:pStyle w:val="ListBullet"/>
       </w:pPr>
       <w:r>
-        <w:t>Python + uv · tree-sitter / tree-sitter-java · SQLite · FastMCP (mcp[cli]) · Azure OpenAI (optional).</w:t>
+        <w:t>Python + uv, tree-sitter / tree-sitter-java, SQLite, FastMCP (mcp[cli]), Azure OpenAI (optional).</w:t>
+      </w:r>
+    </w:p>
+    <w:p>
+      <w:pPr>
+        <w:pStyle w:val="Heading1"/>
+      </w:pPr>
+      <w:r>
+        <w:t>4. Microservices: Cross-Service Flow</w:t>
+      </w:r>
+    </w:p>
+    <w:p>
+      <w:pPr>
+        <w:pStyle w:val="ListBullet"/>
+      </w:pPr>
+      <w:r>
+        <w:t>Index each service independently (order does not matter), naming each with --service.</w:t>
+      </w:r>
+    </w:p>
+    <w:p>
+      <w:pPr>
+        <w:pStyle w:val="ListBullet"/>
+      </w:pPr>
+      <w:r>
+        <w:t>Outbound calls are detected per service: OpenFeign (@FeignClient(name=...)) and RestTemplate (http://&lt;service&gt;/&lt;path&gt;).</w:t>
+      </w:r>
+    </w:p>
+    <w:p>
+      <w:pPr>
+        <w:pStyle w:val="ListBullet"/>
+      </w:pPr>
+      <w:r>
+        <w:t>federate merges per-service graphs (node ids namespaced &lt;service&gt;::) and matches each outbound call to the called service's real endpoint handler, linking them with a 'calls_remote' edge.</w:t>
+      </w:r>
+    </w:p>
+    <w:p>
+      <w:pPr>
+        <w:pStyle w:val="ListBullet"/>
+      </w:pPr>
+      <w:r>
+        <w:t>A single federated MCP exposes every service's full index plus the cross-service links.</w:t>
+      </w:r>
+    </w:p>
+    <w:p>
+      <w:pPr>
+        <w:pStyle w:val="ListBullet"/>
+      </w:pPr>
+      <w:r>
+        <w:t>kg_service_map() shows which service calls which (resolved vs unresolved); kg_request_flow() traces a request across service boundaries; kg_impact_of spans services.</w:t>
+      </w:r>
+    </w:p>
+    <w:p>
+      <w:pPr>
+        <w:pStyle w:val="ListBullet"/>
+      </w:pPr>
+      <w:r>
+        <w:t>Contract: a Feign name / RestTemplate host must equal the called service's --service name; unmatched calls remain visible as unresolved. Re-run federate after re-indexing any service.</w:t>
       </w:r>
     </w:p>
     <w:sectPr>

</xml_diff>

<commit_message>
Enrich: also generate per-node one-line summaries
The enrichment pass now asks the model for a one-line summary per class /
endpoint handler in addition to the feature map, and writes them to
nodes.summary via the same anti-hallucination gate (unknown node ids rejected).
Summaries surface through kg_describe / kg_find_files_for_feature.

- enrich.py: request + write summaries; report summaries_written/rejected
- cli.py: enrich command reports summary counts
- tests: summary surfaces via kg_describe (30 passing)
- docs: refresh PPTX/DOCX to note per-node summaries
</commit_message>
<xml_diff>
--- a/docs/code-kg-overview.docx
+++ b/docs/code-kg-overview.docx
@@ -71,7 +71,7 @@
         <w:pStyle w:val="ListBullet"/>
       </w:pPr>
       <w:r>
-        <w:t>Optional LLM enrichment (Azure OpenAI) adds a feature-&gt;files map, validated against the live graph (anti-hallucination gate).</w:t>
+        <w:t>Optional LLM enrichment (Azure OpenAI) adds a feature-&gt;files map and per-class/endpoint one-line summaries (surfaced by kg_describe), each validated against the live graph (anti-hallucination gate).</w:t>
       </w:r>
     </w:p>
     <w:p>
@@ -127,7 +127,7 @@
         <w:pStyle w:val="ListBullet"/>
       </w:pPr>
       <w:r>
-        <w:t>[3] Enrichment (optional, Azure OpenAI): feature-&gt;files map, anti-hallucination gated.</w:t>
+        <w:t>[3] Enrichment (optional, Azure OpenAI): feature-&gt;files map + per-node one-line summaries, anti-hallucination gated.</w:t>
       </w:r>
     </w:p>
     <w:p>

</xml_diff>